<commit_message>
Add app screenshots to the thesis (new Chapter 3, Section 3.8)
Two real screenshots of the running River Outlook app: the main dashboard
after generating a stochastic outlook, and the "For the curious" panel
showing live AR/MA coefficients, standard errors, and stationarity
evidence for discharge -- direct evidence against "how do we know it's
not garbage" and "how do you estimate the parameters", not just prose
claiming it. Renumbered all figure references (1-8) to stay sequential
in document order now that two figures were inserted mid-chapter.

Per user instruction, the appendix stays scoped to model/pipeline code
only (src/*.py) -- the app/dashboard source is not added to it.
</commit_message>
<xml_diff>
--- a/documents/Computer_Hydrological_Forecasting_Full_Report.docx
+++ b/documents/Computer_Hydrological_Forecasting_Full_Report.docx
@@ -2604,7 +2604,7 @@
           <w:b w:val="0"/>
           <w:sz w:val="24"/>
         </w:rPr>
-        <w:t>The chapter describes the study basin and data sources, the aggregation of daily records to a monthly timestep, the theoretical basis of the ARIMA model, the Box–Jenkins identification and estimation procedure applied independently to each variable, the stochastic forecasting and property-based validation procedure that replaces point-forecast comparison, and the software implementation.</w:t>
+        <w:t>The chapter describes the study basin and data sources, the aggregation of daily records to a monthly timestep, the theoretical basis of the ARIMA model, the Box–Jenkins identification and estimation procedure applied independently to each variable, the stochastic forecasting and property-based validation procedure that replaces point-forecast comparison, the software implementation, and the interactive web application built on it.</w:t>
       </w:r>
     </w:p>
     <w:p>
@@ -3258,6 +3258,173 @@
           <w:sz w:val="24"/>
         </w:rPr>
         <w:t>The entire framework was implemented in the Python programming language. Numerical computation used NumPy (Harris et al., 2020) and SciPy (Virtanen et al., 2020); data handling used pandas (McKinney, 2010); figures were produced with Matplotlib (Hunter, 2007). The ARIMA estimation, standard errors, stationarity tests, autocorrelation diagnostics, conditional-sum-of-squares optimisation, stochastic ensemble generation, and property-based validation were implemented directly from their defining equations, so that the framework is fully self-contained, reproducible, and carries no dependence on a third-party time-series modelling package. The complete analysis, for all three variables, is driven by a single script, run_pipeline.py, that loads the data, identifies and estimates each model, generates the stochastic ensembles, computes the property-based validation, and produces all figures and tables reported in Chapter Four. The source code is reproduced in the Appendix.</w:t>
+      </w:r>
+    </w:p>
+    <w:p>
+      <w:pPr>
+        <w:pStyle w:val="Heading2"/>
+        <w:spacing w:lineRule="auto" w:line="480" w:before="120" w:after="0"/>
+        <w:jc w:val="both"/>
+      </w:pPr>
+      <w:r>
+        <w:rPr>
+          <w:rFonts w:ascii="Times New Roman" w:hAnsi="Times New Roman"/>
+          <w:b/>
+          <w:sz w:val="24"/>
+        </w:rPr>
+        <w:t>3.8 The Web Application</w:t>
+      </w:r>
+    </w:p>
+    <w:p>
+      <w:pPr>
+        <w:spacing w:lineRule="auto" w:line="480" w:before="0" w:after="120"/>
+        <w:jc w:val="both"/>
+      </w:pPr>
+      <w:r>
+        <w:rPr>
+          <w:rFonts w:ascii="Times New Roman" w:hAnsi="Times New Roman"/>
+          <w:b w:val="0"/>
+          <w:sz w:val="24"/>
+        </w:rPr>
+        <w:t>The framework is also deployed as an interactive web application ("River Outlook", built with Streamlit), so that the model can be exercised directly rather than taken on faith from a static report. The application never re-estimates a model: it loads each variable's coefficients from the same results.json produced by run_pipeline.py, so the figures a user sees are generated by exactly the models reported in this chapter, not a separate live fit. Figure 3 shows the application after a forecast has been run: a single action generates a stochastic ensemble for all three variables at once, and the interface reports, per variable, the expected trend, how the outlook compares to the long-term typical level, and a synthetic 90 per cent uncertainty band plotted against the observed history.</w:t>
+      </w:r>
+    </w:p>
+    <w:p>
+      <w:pPr>
+        <w:spacing w:lineRule="auto" w:line="240" w:before="160" w:after="40"/>
+        <w:jc w:val="center"/>
+      </w:pPr>
+      <w:r>
+        <w:drawing>
+          <wp:inline xmlns:a="http://schemas.openxmlformats.org/drawingml/2006/main" xmlns:pic="http://schemas.openxmlformats.org/drawingml/2006/picture">
+            <wp:extent cx="5940000" cy="3268269"/>
+            <wp:docPr id="3" name="Picture 3"/>
+            <wp:cNvGraphicFramePr>
+              <a:graphicFrameLocks noChangeAspect="1"/>
+            </wp:cNvGraphicFramePr>
+            <a:graphic>
+              <a:graphicData uri="http://schemas.openxmlformats.org/drawingml/2006/picture">
+                <pic:pic>
+                  <pic:nvPicPr>
+                    <pic:cNvPr id="0" name="Fig7_AppDashboard.png"/>
+                    <pic:cNvPicPr/>
+                  </pic:nvPicPr>
+                  <pic:blipFill>
+                    <a:blip r:embed="rId14"/>
+                    <a:stretch>
+                      <a:fillRect/>
+                    </a:stretch>
+                  </pic:blipFill>
+                  <pic:spPr>
+                    <a:xfrm>
+                      <a:off x="0" y="0"/>
+                      <a:ext cx="5940000" cy="3268269"/>
+                    </a:xfrm>
+                    <a:prstGeom prst="rect"/>
+                  </pic:spPr>
+                </pic:pic>
+              </a:graphicData>
+            </a:graphic>
+          </wp:inline>
+        </w:drawing>
+      </w:r>
+    </w:p>
+    <w:p>
+      <w:pPr>
+        <w:pStyle w:val="FigureCaption"/>
+        <w:spacing w:lineRule="auto" w:line="240" w:before="40" w:after="240"/>
+        <w:jc w:val="center"/>
+      </w:pPr>
+      <w:r>
+        <w:rPr>
+          <w:rFonts w:ascii="Times New Roman" w:hAnsi="Times New Roman"/>
+          <w:b/>
+          <w:sz w:val="22"/>
+        </w:rPr>
+        <w:t>Figure 3:</w:t>
+      </w:r>
+      <w:r>
+        <w:rPr>
+          <w:rFonts w:ascii="Times New Roman" w:hAnsi="Times New Roman"/>
+          <w:sz w:val="22"/>
+        </w:rPr>
+        <w:t xml:space="preserve"> The River Outlook web application after generating a 12-month stochastic outlook for all three variables, showing the observed history, the synthetic uncertainty band, and the expected path for river flow.</w:t>
+      </w:r>
+    </w:p>
+    <w:p>
+      <w:pPr>
+        <w:spacing w:lineRule="auto" w:line="480" w:before="0" w:after="120"/>
+        <w:jc w:val="both"/>
+      </w:pPr>
+      <w:r>
+        <w:rPr>
+          <w:rFonts w:ascii="Times New Roman" w:hAnsi="Times New Roman"/>
+          <w:b w:val="0"/>
+          <w:sz w:val="24"/>
+        </w:rPr>
+        <w:t>A second panel, "For the curious", exposes the statistical detail behind each headline number rather than asking a reader to take the model's adequacy on trust: the fitted order, the estimated AR/MA coefficients with their standard errors, the stationarity test evidence for the chosen differencing order, and the full property-based validation table. Figure 4 shows this panel for discharge, reproducing the same coefficient and validation values reported in Tables 6 and 8.</w:t>
+      </w:r>
+    </w:p>
+    <w:p>
+      <w:pPr>
+        <w:spacing w:lineRule="auto" w:line="240" w:before="160" w:after="40"/>
+        <w:jc w:val="center"/>
+      </w:pPr>
+      <w:r>
+        <w:drawing>
+          <wp:inline xmlns:a="http://schemas.openxmlformats.org/drawingml/2006/main" xmlns:pic="http://schemas.openxmlformats.org/drawingml/2006/picture">
+            <wp:extent cx="5940000" cy="3268269"/>
+            <wp:docPr id="4" name="Picture 4"/>
+            <wp:cNvGraphicFramePr>
+              <a:graphicFrameLocks noChangeAspect="1"/>
+            </wp:cNvGraphicFramePr>
+            <a:graphic>
+              <a:graphicData uri="http://schemas.openxmlformats.org/drawingml/2006/picture">
+                <pic:pic>
+                  <pic:nvPicPr>
+                    <pic:cNvPr id="0" name="Fig8_AppCoefficients.png"/>
+                    <pic:cNvPicPr/>
+                  </pic:nvPicPr>
+                  <pic:blipFill>
+                    <a:blip r:embed="rId15"/>
+                    <a:stretch>
+                      <a:fillRect/>
+                    </a:stretch>
+                  </pic:blipFill>
+                  <pic:spPr>
+                    <a:xfrm>
+                      <a:off x="0" y="0"/>
+                      <a:ext cx="5940000" cy="3268269"/>
+                    </a:xfrm>
+                    <a:prstGeom prst="rect"/>
+                  </pic:spPr>
+                </pic:pic>
+              </a:graphicData>
+            </a:graphic>
+          </wp:inline>
+        </w:drawing>
+      </w:r>
+    </w:p>
+    <w:p>
+      <w:pPr>
+        <w:pStyle w:val="FigureCaption"/>
+        <w:spacing w:lineRule="auto" w:line="240" w:before="40" w:after="240"/>
+        <w:jc w:val="center"/>
+      </w:pPr>
+      <w:r>
+        <w:rPr>
+          <w:rFonts w:ascii="Times New Roman" w:hAnsi="Times New Roman"/>
+          <w:b/>
+          <w:sz w:val="22"/>
+        </w:rPr>
+        <w:t>Figure 4:</w:t>
+      </w:r>
+      <w:r>
+        <w:rPr>
+          <w:rFonts w:ascii="Times New Roman" w:hAnsi="Times New Roman"/>
+          <w:sz w:val="22"/>
+        </w:rPr>
+        <w:t xml:space="preserve"> The application's 'For the curious' panel for discharge, showing the estimated AR/MA coefficients with standard errors, the stationarity evidence, and the property-based validation table live from the same results reported in Chapter Four.</w:t>
       </w:r>
     </w:p>
     <w:p>
@@ -6480,7 +6647,7 @@
           <w:b w:val="0"/>
           <w:sz w:val="24"/>
         </w:rPr>
-        <w:t>The estimated coefficients of each selected model, with their standard errors from Section 3.5, are given in Table 6. This is the answer to the question order selection alone does not provide: not only what structure was chosen, but what the fitted relationship actually is, and how precisely each part of it is known. Figure 6 shows the same information graphically, as 95 per cent confidence intervals for every coefficient of every model.</w:t>
+        <w:t>The estimated coefficients of each selected model, with their standard errors from Section 3.5, are given in Table 6. This is the answer to the question order selection alone does not provide: not only what structure was chosen, but what the fitted relationship actually is, and how precisely each part of it is known. Figure 5 shows the same information graphically, as 95 per cent confidence intervals for every coefficient of every model.</w:t>
       </w:r>
     </w:p>
     <w:p>
@@ -7529,7 +7696,7 @@
         <w:drawing>
           <wp:inline xmlns:a="http://schemas.openxmlformats.org/drawingml/2006/main" xmlns:pic="http://schemas.openxmlformats.org/drawingml/2006/picture">
             <wp:extent cx="5580000" cy="1913143"/>
-            <wp:docPr id="3" name="Picture 3"/>
+            <wp:docPr id="5" name="Picture 5"/>
             <wp:cNvGraphicFramePr>
               <a:graphicFrameLocks noChangeAspect="1"/>
             </wp:cNvGraphicFramePr>
@@ -7541,7 +7708,7 @@
                     <pic:cNvPicPr/>
                   </pic:nvPicPr>
                   <pic:blipFill>
-                    <a:blip r:embed="rId14"/>
+                    <a:blip r:embed="rId16"/>
                     <a:stretch>
                       <a:fillRect/>
                     </a:stretch>
@@ -7572,7 +7739,7 @@
           <w:b/>
           <w:sz w:val="22"/>
         </w:rPr>
-        <w:t>Figure 6:</w:t>
+        <w:t>Figure 5:</w:t>
       </w:r>
       <w:r>
         <w:rPr>
@@ -7608,7 +7775,7 @@
           <w:b w:val="0"/>
           <w:sz w:val="24"/>
         </w:rPr>
-        <w:t>Residual diagnostics for each model are summarised in Table 7 and shown in Figure 5. The Ljung–Box test examines whether linear autocorrelation remains in the residuals; the ARCH test, a Ljung–Box test applied to the squared residuals, examines conditional heteroscedasticity (volatility clustering); and the Jarque–Bera test examines normality.</w:t>
+        <w:t>Residual diagnostics for each model are summarised in Table 7 and shown in Figure 6. The Ljung–Box test examines whether linear autocorrelation remains in the residuals; the ARCH test, a Ljung–Box test applied to the squared residuals, examines conditional heteroscedasticity (volatility clustering); and the Jarque–Bera test examines normality.</w:t>
       </w:r>
     </w:p>
     <w:p>
@@ -8109,7 +8276,7 @@
         <w:drawing>
           <wp:inline xmlns:a="http://schemas.openxmlformats.org/drawingml/2006/main" xmlns:pic="http://schemas.openxmlformats.org/drawingml/2006/picture">
             <wp:extent cx="5580000" cy="4819091"/>
-            <wp:docPr id="4" name="Picture 4"/>
+            <wp:docPr id="6" name="Picture 6"/>
             <wp:cNvGraphicFramePr>
               <a:graphicFrameLocks noChangeAspect="1"/>
             </wp:cNvGraphicFramePr>
@@ -8121,7 +8288,7 @@
                     <pic:cNvPicPr/>
                   </pic:nvPicPr>
                   <pic:blipFill>
-                    <a:blip r:embed="rId15"/>
+                    <a:blip r:embed="rId17"/>
                     <a:stretch>
                       <a:fillRect/>
                     </a:stretch>
@@ -8152,7 +8319,7 @@
           <w:b/>
           <w:sz w:val="22"/>
         </w:rPr>
-        <w:t>Figure 5:</w:t>
+        <w:t>Figure 6:</w:t>
       </w:r>
       <w:r>
         <w:rPr>
@@ -8202,7 +8369,7 @@
           <w:b w:val="0"/>
           <w:sz w:val="24"/>
         </w:rPr>
-        <w:t>For each variable, the model fitted on the training period generated an ensemble of 1,000 synthetic monthly sequences spanning the validation period, 2004-2014, as described in Section 3.6. Figure 3 compares the 5th-to-95th-percentile band of each ensemble against the actual observed validation-period record. Table 8 reports the property-based validation outcome: for each of the seven summary statistics, whether the historical value falls within the synthetic ensemble's 90 per cent envelope.</w:t>
+        <w:t>For each variable, the model fitted on the training period generated an ensemble of 1,000 synthetic monthly sequences spanning the validation period, 2004-2014, as described in Section 3.6. Figure 7 compares the 5th-to-95th-percentile band of each ensemble against the actual observed validation-period record. Table 8 reports the property-based validation outcome: for each of the seven summary statistics, whether the historical value falls within the synthetic ensemble's 90 per cent envelope.</w:t>
       </w:r>
     </w:p>
     <w:p>
@@ -8214,7 +8381,7 @@
         <w:drawing>
           <wp:inline xmlns:a="http://schemas.openxmlformats.org/drawingml/2006/main" xmlns:pic="http://schemas.openxmlformats.org/drawingml/2006/picture">
             <wp:extent cx="5580000" cy="4311818"/>
-            <wp:docPr id="5" name="Picture 5"/>
+            <wp:docPr id="7" name="Picture 7"/>
             <wp:cNvGraphicFramePr>
               <a:graphicFrameLocks noChangeAspect="1"/>
             </wp:cNvGraphicFramePr>
@@ -8226,7 +8393,7 @@
                     <pic:cNvPicPr/>
                   </pic:nvPicPr>
                   <pic:blipFill>
-                    <a:blip r:embed="rId16"/>
+                    <a:blip r:embed="rId18"/>
                     <a:stretch>
                       <a:fillRect/>
                     </a:stretch>
@@ -8257,7 +8424,7 @@
           <w:b/>
           <w:sz w:val="22"/>
         </w:rPr>
-        <w:t>Figure 3:</w:t>
+        <w:t>Figure 7:</w:t>
       </w:r>
       <w:r>
         <w:rPr>
@@ -8483,7 +8650,7 @@
         <w:drawing>
           <wp:inline xmlns:a="http://schemas.openxmlformats.org/drawingml/2006/main" xmlns:pic="http://schemas.openxmlformats.org/drawingml/2006/picture">
             <wp:extent cx="5580000" cy="1992857"/>
-            <wp:docPr id="6" name="Picture 6"/>
+            <wp:docPr id="8" name="Picture 8"/>
             <wp:cNvGraphicFramePr>
               <a:graphicFrameLocks noChangeAspect="1"/>
             </wp:cNvGraphicFramePr>
@@ -8495,7 +8662,7 @@
                     <pic:cNvPicPr/>
                   </pic:nvPicPr>
                   <pic:blipFill>
-                    <a:blip r:embed="rId17"/>
+                    <a:blip r:embed="rId19"/>
                     <a:stretch>
                       <a:fillRect/>
                     </a:stretch>
@@ -8526,7 +8693,7 @@
           <w:b/>
           <w:sz w:val="22"/>
         </w:rPr>
-        <w:t>Figure 4:</w:t>
+        <w:t>Figure 8:</w:t>
       </w:r>
       <w:r>
         <w:rPr>

</xml_diff>

<commit_message>
Refresh app screenshots, add cross-basin proof figure, update overview docs
Retakes Figures 3/4 (app dashboard + coefficients panel) from the redesigned
River Outlook app. Adds Figure 9, a bar-chart visualization of the Section
4.8 cross-basin check (AR(1) coefficients with 95% CI, colored by Ljung-Box
pass/fail) as evidence beyond the existing Table 9. Updates
PROJECT_OVERVIEW.md and the overview PDF to document everything added in the
two rounds of critical review: the cross-basin check, the design-discharge
worked example, the fixes made, and what was deliberately declined or
deferred. Syncs CLAUDE.md's folder listing and figure/table counts.
</commit_message>
<xml_diff>
--- a/documents/Computer_Hydrological_Forecasting_Full_Report.docx
+++ b/documents/Computer_Hydrological_Forecasting_Full_Report.docx
@@ -3311,7 +3311,7 @@
       <w:r>
         <w:drawing>
           <wp:inline xmlns:a="http://schemas.openxmlformats.org/drawingml/2006/main" xmlns:pic="http://schemas.openxmlformats.org/drawingml/2006/picture">
-            <wp:extent cx="5940000" cy="3268269"/>
+            <wp:extent cx="5940000" cy="3341250"/>
             <wp:docPr id="3" name="Picture 3"/>
             <wp:cNvGraphicFramePr>
               <a:graphicFrameLocks noChangeAspect="1"/>
@@ -3332,7 +3332,7 @@
                   <pic:spPr>
                     <a:xfrm>
                       <a:off x="0" y="0"/>
-                      <a:ext cx="5940000" cy="3268269"/>
+                      <a:ext cx="5940000" cy="3341250"/>
                     </a:xfrm>
                     <a:prstGeom prst="rect"/>
                   </pic:spPr>
@@ -3387,7 +3387,7 @@
       <w:r>
         <w:drawing>
           <wp:inline xmlns:a="http://schemas.openxmlformats.org/drawingml/2006/main" xmlns:pic="http://schemas.openxmlformats.org/drawingml/2006/picture">
-            <wp:extent cx="5940000" cy="3268269"/>
+            <wp:extent cx="5940000" cy="3341250"/>
             <wp:docPr id="4" name="Picture 4"/>
             <wp:cNvGraphicFramePr>
               <a:graphicFrameLocks noChangeAspect="1"/>
@@ -3408,7 +3408,7 @@
                   <pic:spPr>
                     <a:xfrm>
                       <a:off x="0" y="0"/>
-                      <a:ext cx="5940000" cy="3268269"/>
+                      <a:ext cx="5940000" cy="3341250"/>
                     </a:xfrm>
                     <a:prstGeom prst="rect"/>
                   </pic:spPr>
@@ -9920,6 +9920,68 @@
       <w:pPr>
         <w:spacing w:after="0" w:line="240" w:lineRule="auto"/>
       </w:pPr>
+    </w:p>
+    <w:p>
+      <w:pPr>
+        <w:spacing w:lineRule="auto" w:line="240" w:before="160" w:after="40"/>
+        <w:jc w:val="center"/>
+      </w:pPr>
+      <w:r>
+        <w:drawing>
+          <wp:inline xmlns:a="http://schemas.openxmlformats.org/drawingml/2006/main" xmlns:pic="http://schemas.openxmlformats.org/drawingml/2006/picture">
+            <wp:extent cx="5940000" cy="2688574"/>
+            <wp:docPr id="9" name="Picture 9"/>
+            <wp:cNvGraphicFramePr>
+              <a:graphicFrameLocks noChangeAspect="1"/>
+            </wp:cNvGraphicFramePr>
+            <a:graphic>
+              <a:graphicData uri="http://schemas.openxmlformats.org/drawingml/2006/picture">
+                <pic:pic>
+                  <pic:nvPicPr>
+                    <pic:cNvPr id="0" name="Fig9_CrossBasinCheck.png"/>
+                    <pic:cNvPicPr/>
+                  </pic:nvPicPr>
+                  <pic:blipFill>
+                    <a:blip r:embed="rId20"/>
+                    <a:stretch>
+                      <a:fillRect/>
+                    </a:stretch>
+                  </pic:blipFill>
+                  <pic:spPr>
+                    <a:xfrm>
+                      <a:off x="0" y="0"/>
+                      <a:ext cx="5940000" cy="2688574"/>
+                    </a:xfrm>
+                    <a:prstGeom prst="rect"/>
+                  </pic:spPr>
+                </pic:pic>
+              </a:graphicData>
+            </a:graphic>
+          </wp:inline>
+        </w:drawing>
+      </w:r>
+    </w:p>
+    <w:p>
+      <w:pPr>
+        <w:pStyle w:val="FigureCaption"/>
+        <w:spacing w:lineRule="auto" w:line="240" w:before="40" w:after="240"/>
+        <w:jc w:val="center"/>
+      </w:pPr>
+      <w:r>
+        <w:rPr>
+          <w:rFonts w:ascii="Times New Roman" w:hAnsi="Times New Roman"/>
+          <w:b/>
+          <w:sz w:val="22"/>
+        </w:rPr>
+        <w:t>Figure 9:</w:t>
+      </w:r>
+      <w:r>
+        <w:rPr>
+          <w:rFonts w:ascii="Times New Roman" w:hAnsi="Times New Roman"/>
+          <w:sz w:val="22"/>
+        </w:rPr>
+        <w:t xml:space="preserve"> AR(1) coefficient (95% confidence interval, from each model's own standard errors) for discharge and rainfall at the primary Conecuh basin and the two supplementary basins, coloured by whether that fit's Ljung-Box residual test passes. The same numbers as Table 9, shown visually: discharge shows AR(1) persistence at all three basins but fails its Ljung-Box residual test at all three too, while rainfall passes its Ljung-Box test everywhere yet its AR(1) coefficient varies sharply by basin, from statistically indistinguishable from zero at Conecuh to strong, significant persistence at the Great Basin and New England.</w:t>
+      </w:r>
     </w:p>
     <w:p>
       <w:pPr>

</xml_diff>